<commit_message>
auto: XHS cards — 2026-08-03
</commit_message>
<xml_diff>
--- a/docs/xhs/2026-08-03/历史故事/发布文案.docx
+++ b/docs/xhs/2026-08-03/历史故事/发布文案.docx
@@ -11,7 +11,7 @@
         <w:rPr>
           <w:color w:val="CC3333"/>
         </w:rPr>
-        <w:t>历史课本不会告诉你的10个真相</w:t>
+        <w:t>所有历史迷！把这10个故事焊脑子里！</w:t>
       </w:r>
     </w:p>
     <w:p>
@@ -40,24 +40,25 @@
         <w:spacing w:line="384" w:lineRule="auto"/>
       </w:pPr>
       <w:r>
-        <w:t>你敢信？2000年前的中国人就在玩“编程”了！</w:t>
-        <w:br/>
-        <w:t>出土的西汉提花机，用上千根综线储存花纹，一人提拽，一人穿梭引纬，织出云纹、动物甚至文字，比计算机穿孔纸带还早上两千年🤯</w:t>
-        <w:br/>
-        <w:t>而东汉的被中香炉更离谱——几个嵌套金属环，随便你怎么翻滚被子，里面的小钵永远口朝上，香灰不洒，这根本就是现代陀螺仪常平架的鼻祖啊！</w:t>
+        <w:t>救命！一个商人假扮使者，用12头牛镇住秦国大军？弦高犒师这波操作，比电影还炸裂🔥</w:t>
         <w:br/>
         <w:br/>
-        <w:t>战国时期的甘德、石申，纯靠肉眼就发现木星旁边有颗红色小暗星，近两千年后伽利略用望远镜才确认那是木卫，而且他们测出的金木水火土会合周期，误差大多不到半天📡</w:t>
-        <w:br/>
-        <w:t>落下闳直接把正月变成新年开端，把二十四节气完整编入历法，用“无中气置闰”调和阴阳历，这套规则至今还在用📅</w:t>
+        <w:t>今天这10个冷门历史故事，直接把我的认知捶进地心。不盘几个真睡不着。</w:t>
         <w:br/>
         <w:br/>
-        <w:t>什么是真·硬核古人？用脚步丈量河流的郦道元，为注《水经》深山迷路；玄奘偷渡取经，却给大唐带回一百多个国家的精准地理报告；祖冲之把岁差勇敢写进历法，误差仅50秒……</w:t>
-        <w:br/>
-        <w:t>“纸上得来终觉浅，任何一瞬的观测都可能藏着宇宙大秘密。”这些故事让我懂了：匠心与求实，才是穿越时间的硬通货💡</w:t>
+        <w:t>📖 贺知章请李白喝酒，发现没带钱，当场解下御赐金龟换酒。金龟是官职信物，搞不好要掉脑袋的。他只为了一句“谪仙人”，就把规矩和风险全甩脑后。真知音从不看title，只看你灵魂烫不烫。</w:t>
         <w:br/>
         <w:br/>
-        <w:t>你最想送哪项古人黑科技上热搜？评论区聊聊，我抽三位送【古人智慧金句】壁纸～</w:t>
+        <w:t>🖊️ 晋国太史董狐，在竹简上写下“赵盾弑其君”，当朝公示。权臣赵盾委屈辩解：“人是族弟杀的，不是我。”董狐硬怼：“你是正卿，逃跑没出境，回来不惩凶，不是你是谁？” 这才叫职业操守比命硬，史官的风骨把权贵脸都打肿了。</w:t>
+        <w:br/>
+        <w:br/>
+        <w:t>🌌 落下闳一个民间天文爱好者，硬刚国家历法混乱。他把“正月为岁首”写进《太初历》，还塞进二十四节气，让种地的老百姓第一次有了精准时间表。科学不端着，就是要落地生根。</w:t>
+        <w:br/>
+        <w:br/>
+        <w:t>💡 金句预警：历史不是冰冷的年份，而是一个个热气腾腾的灵魂，他们用热爱、硬气和智慧，悄悄搭好了文明的脚手架。</w:t>
+        <w:br/>
+        <w:br/>
+        <w:t>你最想穿越回去过谁的日子？是骑驴觅句的李贺，还是敢用金龟换酒的贺知章？评论区吵起来！</w:t>
       </w:r>
     </w:p>
     <w:p>
@@ -73,7 +74,7 @@
         <w:rPr>
           <w:color w:val="CC3333"/>
         </w:rPr>
-        <w:t>#历史故事  #国学智慧  #古代科技  #冷知识  #每天学点历史  #传统文化  #认知升级  #格局打开</w:t>
+        <w:t>#历史故事  #国学智慧  #古人智慧  #每天学点历史  #传统文化  #冷知识  #认知升级  #格局打开</w:t>
       </w:r>
     </w:p>
     <w:p>
@@ -90,7 +91,7 @@
           <w:b/>
           <w:sz w:val="32"/>
         </w:rPr>
-        <w:t>古人卷疯了</w:t>
+        <w:t>格局炸裂</w:t>
       </w:r>
     </w:p>
     <w:p>
@@ -109,7 +110,7 @@
         <w:rPr>
           <w:sz w:val="24"/>
         </w:rPr>
-        <w:t>#1  战国 · 甘德石申：战国观星的黄金搭档  [古代天文地理]</w:t>
+        <w:t>#1  西汉 · 落下闳与《太初历》  [古代天文地理]</w:t>
       </w:r>
     </w:p>
     <w:p>
@@ -117,7 +118,7 @@
         <w:spacing w:line="336" w:lineRule="auto"/>
       </w:pPr>
       <w:r>
-        <w:t>💡 在极其有限的条件下，细致观察和长期坚持仍能取得突破认知的成果，匠心比工具更重要。</w:t>
+        <w:t>💡 科学创新的价值在于服务民生，一部精确的历法能让百姓顺应天时、不误农时，是古代天文学对文明最直接的贡献。</w:t>
       </w:r>
     </w:p>
     <w:p/>
@@ -129,7 +130,7 @@
         <w:rPr>
           <w:sz w:val="24"/>
         </w:rPr>
-        <w:t>#2  西汉 · 落下闳：他把正月变成新年开端  [古代天文地理]</w:t>
+        <w:t>#2  北魏 · 郦道元与《水经注》  [古代天文地理]</w:t>
       </w:r>
     </w:p>
     <w:p>
@@ -137,7 +138,7 @@
         <w:spacing w:line="336" w:lineRule="auto"/>
       </w:pPr>
       <w:r>
-        <w:t>💡 尊重自然规律、用科学方法协调时间秩序，方能造福万民，让传统历久弥新。</w:t>
+        <w:t>💡 纸上得来终觉浅，真知必待实地探察；将地理考察与人文关怀结合，才能留下经得起时间检验的著作。</w:t>
       </w:r>
     </w:p>
     <w:p/>
@@ -149,7 +150,7 @@
         <w:rPr>
           <w:sz w:val="24"/>
         </w:rPr>
-        <w:t>#3  北魏 · 郦道元：用脚步丈量大地的注书人  [古代天文地理]</w:t>
+        <w:t>#3  战国 · 甘德石申与《甘石星经》  [古代天文地理]</w:t>
       </w:r>
     </w:p>
     <w:p>
@@ -157,7 +158,7 @@
         <w:spacing w:line="336" w:lineRule="auto"/>
       </w:pPr>
       <w:r>
-        <w:t>💡 纸上得来终觉浅，实地求证与文献结合，才能逼近真相，写出传世之作。</w:t>
+        <w:t>💡 早期天文学家仅凭肉眼和坚持，就建立起系统的宇宙图景，展示了观测与记录对于科学进步的奠基性作用。</w:t>
       </w:r>
     </w:p>
     <w:p/>
@@ -169,7 +170,7 @@
         <w:rPr>
           <w:sz w:val="24"/>
         </w:rPr>
-        <w:t>#4  北宋 · 天关客星：宋朝人看见的超新星爆发  [古代天文地理]</w:t>
+        <w:t>#4  北宋 · 天关客星：北宋的超新星观测  [古代天文地理]</w:t>
       </w:r>
     </w:p>
     <w:p>
@@ -177,7 +178,7 @@
         <w:spacing w:line="336" w:lineRule="auto"/>
       </w:pPr>
       <w:r>
-        <w:t>💡 持续而准确的观测记录是科学研究的基石，任何一瞬的现象都可能蕴含着宇宙的大秘密。</w:t>
+        <w:t>💡 严谨的天象记录不仅服务于古代的占卜和历法，还可能成为千年后解开宇宙之谜的钥匙。</w:t>
       </w:r>
     </w:p>
     <w:p/>
@@ -189,7 +190,7 @@
         <w:rPr>
           <w:sz w:val="24"/>
         </w:rPr>
-        <w:t>#5  唐 · 玄奘：偷渡求法却带回精准地理报告  [古代天文地理]</w:t>
+        <w:t>#5  西晋 · 裴秀与制图六体  [古代天文地理]</w:t>
       </w:r>
     </w:p>
     <w:p>
@@ -197,7 +198,7 @@
         <w:spacing w:line="336" w:lineRule="auto"/>
       </w:pPr>
       <w:r>
-        <w:t>💡 毅力和求实精神能使个人旅程转化为全人类的知识财富，跨文化的地理记录具有不朽价值。</w:t>
+        <w:t>💡 从经验中提炼理论，用规则规范实践，是任何一门学科走向成熟的必经之路。</w:t>
       </w:r>
     </w:p>
     <w:p/>
@@ -209,7 +210,7 @@
         <w:rPr>
           <w:sz w:val="24"/>
         </w:rPr>
-        <w:t>#6  南朝·宋齐 · 祖冲之：把岁差写进历法的第一人  [古代天文地理]</w:t>
+        <w:t>#6  唐 · 它山堰：王元玮的治水智慧  [古代天文地理]</w:t>
       </w:r>
     </w:p>
     <w:p>
@@ -217,7 +218,7 @@
         <w:spacing w:line="336" w:lineRule="auto"/>
       </w:pPr>
       <w:r>
-        <w:t>💡 创新往往需要面对世俗的阻力，真知不怕迟来，科学最终会证明它的价值。</w:t>
+        <w:t>💡 优秀的水利工程必深谙自然之势，不求决绝的征服，而在巧妙的顺应和引导。</w:t>
       </w:r>
     </w:p>
     <w:p/>
@@ -229,7 +230,7 @@
         <w:rPr>
           <w:sz w:val="24"/>
         </w:rPr>
-        <w:t>#7  唐 · 推敲：贾岛冲撞韩愈的车队得来的佳句  [唐诗宋词背后的故事]</w:t>
+        <w:t>#7  唐 · 金龟换酒：贺知章识李白  [唐诗宋词背后的故事]</w:t>
       </w:r>
     </w:p>
     <w:p>
@@ -237,7 +238,7 @@
         <w:spacing w:line="336" w:lineRule="auto"/>
       </w:pPr>
       <w:r>
-        <w:t>💡 创作时字斟句酌、虚心求证，常常能化平凡为神奇，也提醒我们艺术需要较真。</w:t>
+        <w:t>💡 真正的知音不以地位论英雄，惺惺相惜的识才之眼和率性而为的真性情，书写了文学史上最动人的友谊。</w:t>
       </w:r>
     </w:p>
     <w:p/>
@@ -249,7 +250,7 @@
         <w:rPr>
           <w:sz w:val="24"/>
         </w:rPr>
-        <w:t>#8  唐 · 李白搁笔：崔颢题诗在前头  [唐诗宋词背后的故事]</w:t>
+        <w:t>#8  唐 · 李贺骑驴觅句  [唐诗宋词背后的故事]</w:t>
       </w:r>
     </w:p>
     <w:p>
@@ -257,7 +258,7 @@
         <w:spacing w:line="336" w:lineRule="auto"/>
       </w:pPr>
       <w:r>
-        <w:t>💡 真正的才华不怕欣赏他人的优点，好胜心和谦逊结合，反而催生出更伟大的作品。</w:t>
+        <w:t>💡 天才源于热爱与勤奋，灵感的火花若不及时捕捉、反复锤炼，终难化为不朽的诗章。</w:t>
       </w:r>
     </w:p>
     <w:p/>
@@ -269,7 +270,7 @@
         <w:rPr>
           <w:sz w:val="24"/>
         </w:rPr>
-        <w:t>#9  东汉 · 被中香炉：东汉的陀螺仪黑科技  [古代科技发明故事]</w:t>
+        <w:t>#9  春秋 · 弦高犒师救郑  [历史故事]</w:t>
       </w:r>
     </w:p>
     <w:p>
@@ -277,7 +278,7 @@
         <w:spacing w:line="336" w:lineRule="auto"/>
       </w:pPr>
       <w:r>
-        <w:t>💡 伟大的发明往往始于生活需求，对平衡和机械的深刻理解，可以创造出超越时代的杰作。</w:t>
+        <w:t>💡 爱国不在位卑，急智和担当能让普通人在关键时刻力挽狂澜，为国家安危筑起隐形防线。</w:t>
       </w:r>
     </w:p>
     <w:p/>
@@ -289,7 +290,7 @@
         <w:rPr>
           <w:sz w:val="24"/>
         </w:rPr>
-        <w:t>#10  西汉 · 提花机：两千年前的编程织锦  [古代科技发明故事]</w:t>
+        <w:t>#10  春秋 · 董狐直笔  [历史故事]</w:t>
       </w:r>
     </w:p>
     <w:p>
@@ -297,7 +298,7 @@
         <w:spacing w:line="336" w:lineRule="auto"/>
       </w:pPr>
       <w:r>
-        <w:t>💡 真正先进的技术可以穿越千年，传统的工艺逻辑里可能跳动着未来科技的基因。</w:t>
+        <w:t>💡 史官的职责是如实记录，不畏权势；真实的历史态度是文明自省的基石。</w:t>
       </w:r>
     </w:p>
     <w:p/>

</xml_diff>

<commit_message>
auto: XHS cards — 2026-08-04
</commit_message>
<xml_diff>
--- a/docs/xhs/2026-08-03/历史故事/发布文案.docx
+++ b/docs/xhs/2026-08-03/历史故事/发布文案.docx
@@ -11,7 +11,7 @@
         <w:rPr>
           <w:color w:val="CC3333"/>
         </w:rPr>
-        <w:t>历史智慧，看这10个故事就够了</w:t>
+        <w:t>看完这10个古人故事，格局瞬间炸裂！</w:t>
       </w:r>
     </w:p>
     <w:p>
@@ -40,25 +40,27 @@
         <w:spacing w:line="384" w:lineRule="auto"/>
       </w:pPr>
       <w:r>
-        <w:t>你知道吗？天上商星和参星永远不可能同时出现，因为它们是上古一对亲兄弟变的！🤯</w:t>
+        <w:t>你敢信吗？诗仙李白也有认怂的时候！🔥</w:t>
+        <w:br/>
+        <w:t>他登上黄鹤楼刚要题诗，看见崔颢的“白云千载空悠悠”，直接搁笔：“眼前有景道不得！”转头仿写一首《登金陵凤凰台》——承认别人优秀，才是真·大诗人格局！🤯</w:t>
         <w:br/>
         <w:br/>
-        <w:t>传说帝喾的儿子阏伯和实沈，见面就兵刃相向，老爹劝不住，干脆把哥俩一个发配到商丘管商星，一个扔到大夏管参星。从此参商永隔，连星空都在帮他们冷战。✨</w:t>
+        <w:t>其实历史里藏了太多这样让人跪碎膝盖的瞬间。落下闳制定《太初历》，把正月定为春节，汉武帝高官厚禄他不要，干完活就归隐山野。💡什么叫“事了拂衣去，深藏功与名”？这就是！</w:t>
         <w:br/>
         <w:br/>
-        <w:t>古人处理兄弟矛盾的方式，一个比一个绝——</w:t>
+        <w:t>还有14岁的王勃，在滕王阁宴会上当着一群大佬的面即兴写序，阎都督本来想让女婿炫技，结果被“落霞与孤鹜齐飞，秋水共长天一色”震到拍桌子叫绝。⚡真本事从来不怕临场考验，机会来了，你得敢接！</w:t>
         <w:br/>
         <w:br/>
-        <w:t>🏯春秋的郑庄公更狠，弟弟共叔段在母亲撑腰下不停作死，庄公表面隐忍，等弟弟起兵直接反杀，留下千古金句：“多行不义必自毙。”原来纵容也是顶级阳谋。</w:t>
+        <w:t>最让我头皮发麻的是宋慈，南宋提刑官，硬是靠验尸验伤验毒理，写出世界第一本法医学专著《洗冤集录》，比欧洲早了350多年！他用红油伞验骨伤，银针试毒，纠正无数冤案。📖对真相死磕，才是对生命最大的敬畏。</w:t>
         <w:br/>
         <w:br/>
-        <w:t>🥀三国曹丕逼曹植七步成诗，“本是同根生，相煎何太急”道尽兄弟相残的悲凉。可如果曹植真造反，还会这么写诗吗？历史没有如果。</w:t>
+        <w:t>其他故事也超绝：周公测影定“天地之中”，郦道元走断腿写《水经注》，张衡水力浑天仪把宇宙搬进屋，敦煌星图领先欧洲几百年……古人这波操作，放到现在全是天花板级别！🚀</w:t>
         <w:br/>
         <w:br/>
-        <w:t>💡看完这些故事突然懂了：血浓于水，但保持距离有时才是对亲情最好的保护。抬头看星星的时候，别忘了珍惜身边愿意和你同框出现的人。</w:t>
+        <w:t>真正的强大，是敢于承认别人比自己牛。真正的智慧，是把一件事做到极致，哪怕没人看见。</w:t>
         <w:br/>
         <w:br/>
-        <w:t>你还知道哪些兄弟阋墙的典故？如果阏伯实沈当年没被分开，会不会比曹丕曹植还惨？评论区等你开麦！🎙️</w:t>
+        <w:t>你最想拥有哪个古人的超能力？评论区聊聊，我赌王勃的即兴才华票数最高！👇</w:t>
       </w:r>
     </w:p>
     <w:p>
@@ -74,7 +76,7 @@
         <w:rPr>
           <w:color w:val="CC3333"/>
         </w:rPr>
-        <w:t>#历史故事  #国学智慧  #古人智慧  #每天学点历史  #传统文化  #格局打开  #自我提升  #冷知识</w:t>
+        <w:t>#历史故事  #国学智慧  #古人智慧  #每天学点历史  #传统文化  #冷知识  #自我提升  #格局打开</w:t>
       </w:r>
     </w:p>
     <w:p>
@@ -91,7 +93,7 @@
           <w:b/>
           <w:sz w:val="32"/>
         </w:rPr>
-        <w:t>古人太绝了</w:t>
+        <w:t>看完格局炸裂</w:t>
       </w:r>
     </w:p>
     <w:p>
@@ -110,7 +112,7 @@
         <w:rPr>
           <w:sz w:val="24"/>
         </w:rPr>
-        <w:t>#1  上古/春秋 · 阏伯实沈：参商永不相见  [古代天文地理]</w:t>
+        <w:t>#1  西周 · 周公测影与登封观星台  [古代天文地理]</w:t>
       </w:r>
     </w:p>
     <w:p>
@@ -118,7 +120,187 @@
         <w:spacing w:line="336" w:lineRule="auto"/>
       </w:pPr>
       <w:r>
-        <w:t>💡 矛盾需要疏导，保持距离有时是化解冲突的智慧；星空也提醒我们珍惜相聚的时光。</w:t>
+        <w:t>💡 古人通过朴素的天文观测确定地理中心，展现了将天象与地理结合的宏观智慧。</w:t>
+      </w:r>
+    </w:p>
+    <w:p/>
+    <w:p>
+      <w:pPr>
+        <w:pStyle w:val="Heading3"/>
+      </w:pPr>
+      <w:r>
+        <w:rPr>
+          <w:sz w:val="24"/>
+        </w:rPr>
+        <w:t>#2  南北朝（北魏） · 郦道元沥血注《水经》  [古代天文地理]</w:t>
+      </w:r>
+    </w:p>
+    <w:p>
+      <w:pPr>
+        <w:spacing w:line="336" w:lineRule="auto"/>
+      </w:pPr>
+      <w:r>
+        <w:t>💡 读万卷书更要行万里路，实地求证才是地理学的灵魂；刚正不阿的精神与著作同样不朽。</w:t>
+      </w:r>
+    </w:p>
+    <w:p/>
+    <w:p>
+      <w:pPr>
+        <w:pStyle w:val="Heading3"/>
+      </w:pPr>
+      <w:r>
+        <w:rPr>
+          <w:sz w:val="24"/>
+        </w:rPr>
+        <w:t>#3  西汉 · 落下闳《太初历》定春节  [古代天文地理]</w:t>
+      </w:r>
+    </w:p>
+    <w:p>
+      <w:pPr>
+        <w:spacing w:line="336" w:lineRule="auto"/>
+      </w:pPr>
+      <w:r>
+        <w:t>💡 科学探索不为功名，淡泊名利方能成就经世致用的大事业。</w:t>
+      </w:r>
+    </w:p>
+    <w:p/>
+    <w:p>
+      <w:pPr>
+        <w:pStyle w:val="Heading3"/>
+      </w:pPr>
+      <w:r>
+        <w:rPr>
+          <w:sz w:val="24"/>
+        </w:rPr>
+        <w:t>#4  东汉 · 张衡造水力浑天仪  [古代天文地理]</w:t>
+      </w:r>
+    </w:p>
+    <w:p>
+      <w:pPr>
+        <w:spacing w:line="336" w:lineRule="auto"/>
+      </w:pPr>
+      <w:r>
+        <w:t>💡 理论与实践相结合，机械制造与天文学交叉，古人用巧思把宇宙搬进屋内。</w:t>
+      </w:r>
+    </w:p>
+    <w:p/>
+    <w:p>
+      <w:pPr>
+        <w:pStyle w:val="Heading3"/>
+      </w:pPr>
+      <w:r>
+        <w:rPr>
+          <w:sz w:val="24"/>
+        </w:rPr>
+        <w:t>#5  唐 · 敦煌星图：千年前的星空宝藏  [古代天文地理]</w:t>
+      </w:r>
+    </w:p>
+    <w:p>
+      <w:pPr>
+        <w:spacing w:line="336" w:lineRule="auto"/>
+      </w:pPr>
+      <w:r>
+        <w:t>💡 流落他乡的珍贵遗产，让我们看到古代中国在世界天文学史上的领先地位。</w:t>
+      </w:r>
+    </w:p>
+    <w:p/>
+    <w:p>
+      <w:pPr>
+        <w:pStyle w:val="Heading3"/>
+      </w:pPr>
+      <w:r>
+        <w:rPr>
+          <w:sz w:val="24"/>
+        </w:rPr>
+        <w:t>#6  隋 · 隋炀帝开凿大运河  [古代天文地理]</w:t>
+      </w:r>
+    </w:p>
+    <w:p>
+      <w:pPr>
+        <w:spacing w:line="336" w:lineRule="auto"/>
+      </w:pPr>
+      <w:r>
+        <w:t>💡 重大工程若不顾民力，必将动摇国本；但从长远看，它又是文明融合的大动脉。</w:t>
+      </w:r>
+    </w:p>
+    <w:p/>
+    <w:p>
+      <w:pPr>
+        <w:pStyle w:val="Heading3"/>
+      </w:pPr>
+      <w:r>
+        <w:rPr>
+          <w:sz w:val="24"/>
+        </w:rPr>
+        <w:t>#7  唐 · 贾岛炼字：推敲传佳话  [唐诗宋词背后的故事]</w:t>
+      </w:r>
+    </w:p>
+    <w:p>
+      <w:pPr>
+        <w:spacing w:line="336" w:lineRule="auto"/>
+      </w:pPr>
+      <w:r>
+        <w:t>💡 精益求精的创作态度成就经典；一字之差，境界迥异，炼字即炼意。</w:t>
+      </w:r>
+    </w:p>
+    <w:p/>
+    <w:p>
+      <w:pPr>
+        <w:pStyle w:val="Heading3"/>
+      </w:pPr>
+      <w:r>
+        <w:rPr>
+          <w:sz w:val="24"/>
+        </w:rPr>
+        <w:t>#8  唐 · 王勃即席挥毫滕王阁序  [唐诗宋词背后的故事]</w:t>
+      </w:r>
+    </w:p>
+    <w:p>
+      <w:pPr>
+        <w:spacing w:line="336" w:lineRule="auto"/>
+      </w:pPr>
+      <w:r>
+        <w:t>💡 真才实学经得起即兴考验；机遇来临时，要敢于当仁不让地展示自己。</w:t>
+      </w:r>
+    </w:p>
+    <w:p/>
+    <w:p>
+      <w:pPr>
+        <w:pStyle w:val="Heading3"/>
+      </w:pPr>
+      <w:r>
+        <w:rPr>
+          <w:sz w:val="24"/>
+        </w:rPr>
+        <w:t>#9  唐 · 李白黄鹤楼搁笔：眼前有景道不得  [唐诗宋词背后的故事]</w:t>
+      </w:r>
+    </w:p>
+    <w:p>
+      <w:pPr>
+        <w:spacing w:line="336" w:lineRule="auto"/>
+      </w:pPr>
+      <w:r>
+        <w:t>💡 承认他人的优秀并不降低自己，胸襟开阔方是真正的大诗人风采。</w:t>
+      </w:r>
+    </w:p>
+    <w:p/>
+    <w:p>
+      <w:pPr>
+        <w:pStyle w:val="Heading3"/>
+      </w:pPr>
+      <w:r>
+        <w:rPr>
+          <w:sz w:val="24"/>
+        </w:rPr>
+        <w:t>#10  南宋 · 宋慈与《洗冤集录》：法医鼻祖  [历史故事]</w:t>
+      </w:r>
+    </w:p>
+    <w:p>
+      <w:pPr>
+        <w:spacing w:line="336" w:lineRule="auto"/>
+      </w:pPr>
+      <w:r>
+        <w:t>💡 以实证精神取代臆断，是司法文明的重大进步；对真相的执着，是对生命最大的敬畏。</w:t>
       </w:r>
     </w:p>
     <w:p/>

</xml_diff>